<commit_message>
Updated french figures as well as proof read the translation output
</commit_message>
<xml_diff>
--- a/Borealis infosheet/Borealis V2 Français.docx
+++ b/Borealis infosheet/Borealis V2 Français.docx
@@ -57,7 +57,7 @@
           <w:color w:val="000000"/>
           <w:sz w:val="32"/>
           <w:szCs w:val="32"/>
-          <w:lang w:eastAsia="fr-CA"/>
+          <w:lang w:val="fr-CA" w:eastAsia="fr-CA"/>
         </w:rPr>
       </w:pPr>
       <w:r>
@@ -66,7 +66,7 @@
           <w:color w:val="000000"/>
           <w:sz w:val="32"/>
           <w:szCs w:val="32"/>
-          <w:lang w:eastAsia="fr-CA"/>
+          <w:lang w:val="fr-CA" w:eastAsia="fr-CA"/>
         </w:rPr>
         <w:t>Introduction</w:t>
       </w:r>
@@ -301,7 +301,7 @@
           <w:color w:val="000000"/>
           <w:lang w:val="fr-CA" w:eastAsia="fr-CA"/>
         </w:rPr>
-        <w:t xml:space="preserve">Les chercheurs d'universités </w:t>
+        <w:t xml:space="preserve">Les chercheurs d'universités non-membres peuvent créer un compte Borealis, mais </w:t>
       </w:r>
       <w:r>
         <w:rPr>
@@ -309,7 +309,7 @@
           <w:color w:val="000000"/>
           <w:lang w:val="fr-CA" w:eastAsia="fr-CA"/>
         </w:rPr>
-        <w:t>non-membres</w:t>
+        <w:t>l’</w:t>
       </w:r>
       <w:r>
         <w:rPr>
@@ -317,7 +317,7 @@
           <w:color w:val="000000"/>
           <w:lang w:val="fr-CA" w:eastAsia="fr-CA"/>
         </w:rPr>
-        <w:t xml:space="preserve"> peuvent créer un compte Borealis, mais </w:t>
+        <w:t xml:space="preserve">accès aux données </w:t>
       </w:r>
       <w:r>
         <w:rPr>
@@ -325,7 +325,7 @@
           <w:color w:val="000000"/>
           <w:lang w:val="fr-CA" w:eastAsia="fr-CA"/>
         </w:rPr>
-        <w:t>l’</w:t>
+        <w:t xml:space="preserve">sera </w:t>
       </w:r>
       <w:r>
         <w:rPr>
@@ -333,7 +333,7 @@
           <w:color w:val="000000"/>
           <w:lang w:val="fr-CA" w:eastAsia="fr-CA"/>
         </w:rPr>
-        <w:t xml:space="preserve">accès aux données </w:t>
+        <w:t xml:space="preserve">restreint. Les membres intéressés peuvent contacter leur bibliothécaire de données pour </w:t>
       </w:r>
       <w:r>
         <w:rPr>
@@ -341,7 +341,7 @@
           <w:color w:val="000000"/>
           <w:lang w:val="fr-CA" w:eastAsia="fr-CA"/>
         </w:rPr>
-        <w:t xml:space="preserve">sera </w:t>
+        <w:t>faire part</w:t>
       </w:r>
       <w:r>
         <w:rPr>
@@ -349,57 +349,57 @@
           <w:color w:val="000000"/>
           <w:lang w:val="fr-CA" w:eastAsia="fr-CA"/>
         </w:rPr>
-        <w:t>restreint</w:t>
-      </w:r>
-      <w:r>
+        <w:t xml:space="preserve"> de leur intérêt pour Borealis.</w:t>
+      </w:r>
+    </w:p>
+    <w:p>
+      <w:pPr>
         <w:rPr>
           <w:rFonts w:ascii="Times New Roman" w:eastAsia="Times New Roman" w:hAnsi="Times New Roman" w:cs="Times New Roman"/>
           <w:color w:val="000000"/>
           <w:lang w:val="fr-CA" w:eastAsia="fr-CA"/>
         </w:rPr>
-        <w:t xml:space="preserve">. Les membres intéressés peuvent contacter leur bibliothécaire de données pour </w:t>
-      </w:r>
-      <w:r>
+      </w:pPr>
+    </w:p>
+    <w:p>
+      <w:pPr>
         <w:rPr>
           <w:rFonts w:ascii="Times New Roman" w:eastAsia="Times New Roman" w:hAnsi="Times New Roman" w:cs="Times New Roman"/>
           <w:color w:val="000000"/>
           <w:lang w:val="fr-CA" w:eastAsia="fr-CA"/>
         </w:rPr>
-        <w:t>faire part</w:t>
-      </w:r>
+      </w:pPr>
       <w:r>
         <w:rPr>
           <w:rFonts w:ascii="Times New Roman" w:eastAsia="Times New Roman" w:hAnsi="Times New Roman" w:cs="Times New Roman"/>
           <w:color w:val="000000"/>
           <w:lang w:val="fr-CA" w:eastAsia="fr-CA"/>
         </w:rPr>
-        <w:t xml:space="preserve"> de leur intérêt pour Borealis.</w:t>
-      </w:r>
-    </w:p>
-    <w:p>
-      <w:pPr>
+        <w:t>Borealis conserve des ensembles de données pour les institutions membres et les organismes de recherche participants dans leurs propres référentiels institutionnels appelés « Dataverses ».</w:t>
+      </w:r>
+      <w:r>
         <w:rPr>
           <w:rFonts w:ascii="Times New Roman" w:eastAsia="Times New Roman" w:hAnsi="Times New Roman" w:cs="Times New Roman"/>
           <w:color w:val="000000"/>
           <w:lang w:val="fr-CA" w:eastAsia="fr-CA"/>
         </w:rPr>
-      </w:pPr>
-    </w:p>
-    <w:p>
-      <w:pPr>
+        <w:t xml:space="preserve"> </w:t>
+      </w:r>
+      <w:r>
         <w:rPr>
           <w:rFonts w:ascii="Times New Roman" w:eastAsia="Times New Roman" w:hAnsi="Times New Roman" w:cs="Times New Roman"/>
           <w:color w:val="000000"/>
           <w:lang w:val="fr-CA" w:eastAsia="fr-CA"/>
         </w:rPr>
-      </w:pPr>
+        <w:t xml:space="preserve">Borealis est </w:t>
+      </w:r>
       <w:r>
         <w:rPr>
           <w:rFonts w:ascii="Times New Roman" w:eastAsia="Times New Roman" w:hAnsi="Times New Roman" w:cs="Times New Roman"/>
           <w:color w:val="000000"/>
           <w:lang w:val="fr-CA" w:eastAsia="fr-CA"/>
         </w:rPr>
-        <w:t>Borealis conserve des ensembles de données pour les institutions membres et les organismes de recherche participants dans leurs propres référentiels institutionnels appelés « Dataverses ».</w:t>
+        <w:t>donc</w:t>
       </w:r>
       <w:r>
         <w:rPr>
@@ -407,39 +407,137 @@
           <w:color w:val="000000"/>
           <w:lang w:val="fr-CA" w:eastAsia="fr-CA"/>
         </w:rPr>
+        <w:t xml:space="preserve"> le service qui héberge et permet la recherche d</w:t>
+      </w:r>
+      <w:r>
+        <w:rPr>
+          <w:rFonts w:ascii="Times New Roman" w:eastAsia="Times New Roman" w:hAnsi="Times New Roman" w:cs="Times New Roman"/>
+          <w:color w:val="000000"/>
+          <w:lang w:val="fr-CA" w:eastAsia="fr-CA"/>
+        </w:rPr>
+        <w:t>ans</w:t>
+      </w:r>
+      <w:r>
+        <w:rPr>
+          <w:rFonts w:ascii="Times New Roman" w:eastAsia="Times New Roman" w:hAnsi="Times New Roman" w:cs="Times New Roman"/>
+          <w:color w:val="000000"/>
+          <w:lang w:val="fr-CA" w:eastAsia="fr-CA"/>
+        </w:rPr>
+        <w:t xml:space="preserve"> ces Dataverses. </w:t>
+      </w:r>
+      <w:r>
+        <w:rPr>
+          <w:rFonts w:ascii="Times New Roman" w:eastAsia="Times New Roman" w:hAnsi="Times New Roman" w:cs="Times New Roman"/>
+          <w:color w:val="000000"/>
+          <w:lang w:val="fr-CA" w:eastAsia="fr-CA"/>
+        </w:rPr>
+        <w:t>Cette approche facilite l’accès aux données de recherche</w:t>
+      </w:r>
+      <w:r>
+        <w:rPr>
+          <w:rFonts w:ascii="Times New Roman" w:eastAsia="Times New Roman" w:hAnsi="Times New Roman" w:cs="Times New Roman"/>
+          <w:color w:val="000000"/>
+          <w:lang w:val="fr-CA" w:eastAsia="fr-CA"/>
+        </w:rPr>
+        <w:t xml:space="preserve"> entre les institutions membres. </w:t>
+      </w:r>
+      <w:r>
+        <w:rPr>
+          <w:rFonts w:ascii="Times New Roman" w:eastAsia="Times New Roman" w:hAnsi="Times New Roman" w:cs="Times New Roman"/>
+          <w:color w:val="000000"/>
+          <w:lang w:val="fr-CA" w:eastAsia="fr-CA"/>
+        </w:rPr>
+        <w:t xml:space="preserve">Cela étant dit, certains ensembles de données peuvent </w:t>
+      </w:r>
+      <w:r>
+        <w:rPr>
+          <w:rFonts w:ascii="Times New Roman" w:eastAsia="Times New Roman" w:hAnsi="Times New Roman" w:cs="Times New Roman"/>
+          <w:color w:val="000000"/>
+          <w:lang w:val="fr-CA" w:eastAsia="fr-CA"/>
+        </w:rPr>
+        <w:t>être verrouillé</w:t>
+      </w:r>
+      <w:r>
+        <w:rPr>
+          <w:rFonts w:ascii="Times New Roman" w:eastAsia="Times New Roman" w:hAnsi="Times New Roman" w:cs="Times New Roman"/>
+          <w:color w:val="000000"/>
+          <w:lang w:val="fr-CA" w:eastAsia="fr-CA"/>
+        </w:rPr>
+        <w:t>s</w:t>
+      </w:r>
+      <w:r>
+        <w:rPr>
+          <w:rFonts w:ascii="Times New Roman" w:eastAsia="Times New Roman" w:hAnsi="Times New Roman" w:cs="Times New Roman"/>
+          <w:color w:val="000000"/>
+          <w:lang w:val="fr-CA" w:eastAsia="fr-CA"/>
+        </w:rPr>
+        <w:t xml:space="preserve"> et nécessiter une autorisation d'accès</w:t>
+      </w:r>
+      <w:r>
+        <w:rPr>
+          <w:rFonts w:ascii="Times New Roman" w:eastAsia="Times New Roman" w:hAnsi="Times New Roman" w:cs="Times New Roman"/>
+          <w:color w:val="000000"/>
+          <w:lang w:val="fr-CA" w:eastAsia="fr-CA"/>
+        </w:rPr>
+        <w:t xml:space="preserve">. Ces ensembles de données verrouillés sont d’ailleurs plus difficiles à trouver, ce qui constitue en soi un certain problème : </w:t>
+      </w:r>
+      <w:r>
+        <w:rPr>
+          <w:rFonts w:ascii="Times New Roman" w:eastAsia="Times New Roman" w:hAnsi="Times New Roman" w:cs="Times New Roman"/>
+          <w:color w:val="000000"/>
+          <w:lang w:val="fr-CA" w:eastAsia="fr-CA"/>
+        </w:rPr>
+        <w:t xml:space="preserve">sans l’accès aux fichiers, ceux-ci deviennent beaucoup plus difficile à trouver. Pour certain, la découvrabilité réduite de données sensible, même si verrouillé, s’avère être un risque </w:t>
+      </w:r>
+      <w:r>
+        <w:rPr>
+          <w:rFonts w:ascii="Times New Roman" w:eastAsia="Times New Roman" w:hAnsi="Times New Roman" w:cs="Times New Roman"/>
+          <w:color w:val="000000"/>
+          <w:lang w:val="fr-CA" w:eastAsia="fr-CA"/>
+        </w:rPr>
+        <w:t xml:space="preserve">qu’ils ne sont pas prêt à prendre. </w:t>
+      </w:r>
+      <w:r>
+        <w:rPr>
+          <w:rFonts w:ascii="Times New Roman" w:eastAsia="Times New Roman" w:hAnsi="Times New Roman" w:cs="Times New Roman"/>
+          <w:color w:val="000000"/>
+          <w:lang w:val="fr-CA" w:eastAsia="fr-CA"/>
+        </w:rPr>
         <w:t xml:space="preserve"> </w:t>
       </w:r>
-      <w:r>
+    </w:p>
+    <w:p>
+      <w:pPr>
         <w:rPr>
           <w:rFonts w:ascii="Times New Roman" w:eastAsia="Times New Roman" w:hAnsi="Times New Roman" w:cs="Times New Roman"/>
           <w:color w:val="000000"/>
           <w:lang w:val="fr-CA" w:eastAsia="fr-CA"/>
         </w:rPr>
-        <w:t xml:space="preserve">Borealis est </w:t>
-      </w:r>
+      </w:pPr>
       <w:r>
         <w:rPr>
           <w:rFonts w:ascii="Times New Roman" w:eastAsia="Times New Roman" w:hAnsi="Times New Roman" w:cs="Times New Roman"/>
           <w:color w:val="000000"/>
           <w:lang w:val="fr-CA" w:eastAsia="fr-CA"/>
         </w:rPr>
-        <w:t>donc</w:t>
-      </w:r>
-      <w:r>
+        <w:t xml:space="preserve"> </w:t>
+      </w:r>
+    </w:p>
+    <w:p>
+      <w:pPr>
         <w:rPr>
           <w:rFonts w:ascii="Times New Roman" w:eastAsia="Times New Roman" w:hAnsi="Times New Roman" w:cs="Times New Roman"/>
           <w:color w:val="000000"/>
           <w:lang w:val="fr-CA" w:eastAsia="fr-CA"/>
         </w:rPr>
-        <w:t xml:space="preserve"> le service qui héberge et permet la recherche d</w:t>
-      </w:r>
+      </w:pPr>
       <w:r>
         <w:rPr>
           <w:rFonts w:ascii="Times New Roman" w:eastAsia="Times New Roman" w:hAnsi="Times New Roman" w:cs="Times New Roman"/>
           <w:color w:val="000000"/>
           <w:lang w:val="fr-CA" w:eastAsia="fr-CA"/>
         </w:rPr>
-        <w:t>ans</w:t>
+        <w:t xml:space="preserve">Cependant, il est entièrement possible de rendre un ensemble de données découvrable tout en préservant la confidentialité de leurs données de recherche. Ceci peut être accompli en </w:t>
       </w:r>
       <w:r>
         <w:rPr>
@@ -447,7 +545,7 @@
           <w:color w:val="000000"/>
           <w:lang w:val="fr-CA" w:eastAsia="fr-CA"/>
         </w:rPr>
-        <w:t xml:space="preserve"> ces </w:t>
+        <w:t xml:space="preserve">rendant les métadonnées de leur recherche disponible sans permettre l’accès aux données de recherche réelles, </w:t>
       </w:r>
       <w:r>
         <w:rPr>
@@ -455,7 +553,7 @@
           <w:color w:val="000000"/>
           <w:lang w:val="fr-CA" w:eastAsia="fr-CA"/>
         </w:rPr>
-        <w:t>Dataverses</w:t>
+        <w:t>c'est-à-dire, à moins qu</w:t>
       </w:r>
       <w:r>
         <w:rPr>
@@ -463,7 +561,7 @@
           <w:color w:val="000000"/>
           <w:lang w:val="fr-CA" w:eastAsia="fr-CA"/>
         </w:rPr>
-        <w:t xml:space="preserve">. </w:t>
+        <w:t>e quelqu’un</w:t>
       </w:r>
       <w:r>
         <w:rPr>
@@ -471,7 +569,7 @@
           <w:color w:val="000000"/>
           <w:lang w:val="fr-CA" w:eastAsia="fr-CA"/>
         </w:rPr>
-        <w:t>Cette approche facilite l’accès aux données de recherche</w:t>
+        <w:t xml:space="preserve"> e</w:t>
       </w:r>
       <w:r>
         <w:rPr>
@@ -479,7 +577,7 @@
           <w:color w:val="000000"/>
           <w:lang w:val="fr-CA" w:eastAsia="fr-CA"/>
         </w:rPr>
-        <w:t xml:space="preserve"> entre les institutions membres. </w:t>
+        <w:t>n</w:t>
       </w:r>
       <w:r>
         <w:rPr>
@@ -487,161 +585,7 @@
           <w:color w:val="000000"/>
           <w:lang w:val="fr-CA" w:eastAsia="fr-CA"/>
         </w:rPr>
-        <w:t xml:space="preserve">Cela étant dit, certains ensembles de données peuvent </w:t>
-      </w:r>
-      <w:r>
-        <w:rPr>
-          <w:rFonts w:ascii="Times New Roman" w:eastAsia="Times New Roman" w:hAnsi="Times New Roman" w:cs="Times New Roman"/>
-          <w:color w:val="000000"/>
-          <w:lang w:val="fr-CA" w:eastAsia="fr-CA"/>
-        </w:rPr>
-        <w:t>être verrouillé</w:t>
-      </w:r>
-      <w:r>
-        <w:rPr>
-          <w:rFonts w:ascii="Times New Roman" w:eastAsia="Times New Roman" w:hAnsi="Times New Roman" w:cs="Times New Roman"/>
-          <w:color w:val="000000"/>
-          <w:lang w:val="fr-CA" w:eastAsia="fr-CA"/>
-        </w:rPr>
-        <w:t>s</w:t>
-      </w:r>
-      <w:r>
-        <w:rPr>
-          <w:rFonts w:ascii="Times New Roman" w:eastAsia="Times New Roman" w:hAnsi="Times New Roman" w:cs="Times New Roman"/>
-          <w:color w:val="000000"/>
-          <w:lang w:val="fr-CA" w:eastAsia="fr-CA"/>
-        </w:rPr>
-        <w:t xml:space="preserve"> et nécessiter une autorisation d'accès</w:t>
-      </w:r>
-      <w:r>
-        <w:rPr>
-          <w:rFonts w:ascii="Times New Roman" w:eastAsia="Times New Roman" w:hAnsi="Times New Roman" w:cs="Times New Roman"/>
-          <w:color w:val="000000"/>
-          <w:lang w:val="fr-CA" w:eastAsia="fr-CA"/>
-        </w:rPr>
-        <w:t xml:space="preserve">. Ces ensembles de données verrouillés sont d’ailleurs plus difficiles à trouver, ce qui constitue en soi un certain problème : </w:t>
-      </w:r>
-      <w:r>
-        <w:rPr>
-          <w:rFonts w:ascii="Times New Roman" w:eastAsia="Times New Roman" w:hAnsi="Times New Roman" w:cs="Times New Roman"/>
-          <w:color w:val="000000"/>
-          <w:lang w:val="fr-CA" w:eastAsia="fr-CA"/>
-        </w:rPr>
-        <w:t xml:space="preserve">sans l’accès aux fichiers, ceux-ci deviennent beaucoup plus difficile à trouver. Pour certain, la découvrabilité réduite de données sensible, même si verrouillé, s’avère être un risque </w:t>
-      </w:r>
-      <w:r>
-        <w:rPr>
-          <w:rFonts w:ascii="Times New Roman" w:eastAsia="Times New Roman" w:hAnsi="Times New Roman" w:cs="Times New Roman"/>
-          <w:color w:val="000000"/>
-          <w:lang w:val="fr-CA" w:eastAsia="fr-CA"/>
-        </w:rPr>
-        <w:t xml:space="preserve">qu’ils ne sont pas prêt à prendre. </w:t>
-      </w:r>
-      <w:r>
-        <w:rPr>
-          <w:rFonts w:ascii="Times New Roman" w:eastAsia="Times New Roman" w:hAnsi="Times New Roman" w:cs="Times New Roman"/>
-          <w:color w:val="000000"/>
-          <w:lang w:val="fr-CA" w:eastAsia="fr-CA"/>
-        </w:rPr>
-        <w:t xml:space="preserve"> </w:t>
-      </w:r>
-    </w:p>
-    <w:p>
-      <w:pPr>
-        <w:rPr>
-          <w:rFonts w:ascii="Times New Roman" w:eastAsia="Times New Roman" w:hAnsi="Times New Roman" w:cs="Times New Roman"/>
-          <w:color w:val="000000"/>
-          <w:lang w:val="fr-CA" w:eastAsia="fr-CA"/>
-        </w:rPr>
-      </w:pPr>
-      <w:r>
-        <w:rPr>
-          <w:rFonts w:ascii="Times New Roman" w:eastAsia="Times New Roman" w:hAnsi="Times New Roman" w:cs="Times New Roman"/>
-          <w:color w:val="000000"/>
-          <w:lang w:val="fr-CA" w:eastAsia="fr-CA"/>
-        </w:rPr>
-        <w:t xml:space="preserve"> </w:t>
-      </w:r>
-    </w:p>
-    <w:p>
-      <w:pPr>
-        <w:rPr>
-          <w:rFonts w:ascii="Times New Roman" w:eastAsia="Times New Roman" w:hAnsi="Times New Roman" w:cs="Times New Roman"/>
-          <w:color w:val="000000"/>
-          <w:lang w:val="fr-CA" w:eastAsia="fr-CA"/>
-        </w:rPr>
-      </w:pPr>
-      <w:r>
-        <w:rPr>
-          <w:rFonts w:ascii="Times New Roman" w:eastAsia="Times New Roman" w:hAnsi="Times New Roman" w:cs="Times New Roman"/>
-          <w:color w:val="000000"/>
-          <w:lang w:val="fr-CA" w:eastAsia="fr-CA"/>
-        </w:rPr>
-        <w:t xml:space="preserve">Cependant, il est entièrement possible de rendre un ensemble de données découvrable tout en préservant la confidentialité de leurs données de recherche. Ceci peut être accompli en </w:t>
-      </w:r>
-      <w:r>
-        <w:rPr>
-          <w:rFonts w:ascii="Times New Roman" w:eastAsia="Times New Roman" w:hAnsi="Times New Roman" w:cs="Times New Roman"/>
-          <w:color w:val="000000"/>
-          <w:lang w:val="fr-CA" w:eastAsia="fr-CA"/>
-        </w:rPr>
-        <w:t xml:space="preserve">rendant les métadonnées de leur recherche disponible sans permettre l’accès aux données de recherche réelles, </w:t>
-      </w:r>
-      <w:r>
-        <w:rPr>
-          <w:rFonts w:ascii="Times New Roman" w:eastAsia="Times New Roman" w:hAnsi="Times New Roman" w:cs="Times New Roman"/>
-          <w:color w:val="000000"/>
-          <w:lang w:val="fr-CA" w:eastAsia="fr-CA"/>
-        </w:rPr>
-        <w:t>c'est-à-dire, à moins qu</w:t>
-      </w:r>
-      <w:r>
-        <w:rPr>
-          <w:rFonts w:ascii="Times New Roman" w:eastAsia="Times New Roman" w:hAnsi="Times New Roman" w:cs="Times New Roman"/>
-          <w:color w:val="000000"/>
-          <w:lang w:val="fr-CA" w:eastAsia="fr-CA"/>
-        </w:rPr>
-        <w:t>e quelqu’un</w:t>
-      </w:r>
-      <w:r>
-        <w:rPr>
-          <w:rFonts w:ascii="Times New Roman" w:eastAsia="Times New Roman" w:hAnsi="Times New Roman" w:cs="Times New Roman"/>
-          <w:color w:val="000000"/>
-          <w:lang w:val="fr-CA" w:eastAsia="fr-CA"/>
-        </w:rPr>
-        <w:t xml:space="preserve"> e</w:t>
-      </w:r>
-      <w:r>
-        <w:rPr>
-          <w:rFonts w:ascii="Times New Roman" w:eastAsia="Times New Roman" w:hAnsi="Times New Roman" w:cs="Times New Roman"/>
-          <w:color w:val="000000"/>
-          <w:lang w:val="fr-CA" w:eastAsia="fr-CA"/>
-        </w:rPr>
-        <w:t>n</w:t>
-      </w:r>
-      <w:r>
-        <w:rPr>
-          <w:rFonts w:ascii="Times New Roman" w:eastAsia="Times New Roman" w:hAnsi="Times New Roman" w:cs="Times New Roman"/>
-          <w:color w:val="000000"/>
-          <w:lang w:val="fr-CA" w:eastAsia="fr-CA"/>
-        </w:rPr>
-        <w:t xml:space="preserve"> </w:t>
-      </w:r>
-      <w:r>
-        <w:rPr>
-          <w:rFonts w:ascii="Times New Roman" w:eastAsia="Times New Roman" w:hAnsi="Times New Roman" w:cs="Times New Roman"/>
-          <w:color w:val="000000"/>
-          <w:lang w:val="fr-CA" w:eastAsia="fr-CA"/>
-        </w:rPr>
-        <w:t>demande</w:t>
-      </w:r>
-      <w:r>
-        <w:rPr>
-          <w:rFonts w:ascii="Times New Roman" w:eastAsia="Times New Roman" w:hAnsi="Times New Roman" w:cs="Times New Roman"/>
-          <w:color w:val="000000"/>
-          <w:lang w:val="fr-CA" w:eastAsia="fr-CA"/>
-        </w:rPr>
-        <w:t xml:space="preserve"> la permission</w:t>
+        <w:t xml:space="preserve"> demande la permission</w:t>
       </w:r>
       <w:r>
         <w:rPr>
@@ -1145,7 +1089,23 @@
           <w:color w:val="000000"/>
           <w:lang w:eastAsia="fr-CA"/>
         </w:rPr>
-        <w:t>orealis could be a central tool.</w:t>
+        <w:t>orealis could be a central tool</w:t>
+      </w:r>
+      <w:r>
+        <w:rPr>
+          <w:rFonts w:ascii="Times New Roman" w:eastAsia="Times New Roman" w:hAnsi="Times New Roman" w:cs="Times New Roman"/>
+          <w:color w:val="000000"/>
+          <w:lang w:eastAsia="fr-CA"/>
+        </w:rPr>
+        <w:t xml:space="preserve"> in facilitating </w:t>
+      </w:r>
+      <w:r>
+        <w:rPr>
+          <w:rFonts w:ascii="Times New Roman" w:eastAsia="Times New Roman" w:hAnsi="Times New Roman" w:cs="Times New Roman"/>
+          <w:color w:val="000000"/>
+          <w:lang w:eastAsia="fr-CA"/>
+        </w:rPr>
+        <w:t>.</w:t>
       </w:r>
     </w:p>
     <w:p>
@@ -6902,7 +6862,7 @@
   <w15:commentEx w15:paraId="33684AEE" w15:done="1"/>
   <w15:commentEx w15:paraId="616849CC" w15:done="1"/>
   <w15:commentEx w15:paraId="0AFE700E" w15:done="1"/>
-  <w15:commentEx w15:paraId="69E832FD" w15:done="0"/>
+  <w15:commentEx w15:paraId="69E832FD" w15:done="1"/>
   <w15:commentEx w15:paraId="2EBC47A6" w15:done="1"/>
   <w15:commentEx w15:paraId="10C4B841" w15:done="1"/>
   <w15:commentEx w15:paraId="446F7A0F" w15:done="1"/>
@@ -6910,7 +6870,7 @@
   <w15:commentEx w15:paraId="25CA384D" w15:done="1"/>
   <w15:commentEx w15:paraId="45004222" w15:done="1"/>
   <w15:commentEx w15:paraId="462C9291" w15:done="1"/>
-  <w15:commentEx w15:paraId="07302CBF" w15:done="0"/>
+  <w15:commentEx w15:paraId="07302CBF" w15:done="1"/>
 </w15:commentsEx>
 </file>
 

</xml_diff>